<commit_message>
Último commit de atualizações finais
</commit_message>
<xml_diff>
--- a/Documentação/Documentacao-V-Filmes.docx
+++ b/Documentação/Documentacao-V-Filmes.docx
@@ -13,7 +13,7 @@
           <w:noProof/>
         </w:rPr>
         <w:drawing>
-          <wp:inline distT="0" distB="0" distL="0" distR="0" wp14:anchorId="24BCBD53" wp14:editId="4C411DA9">
+          <wp:inline distT="0" distB="0" distL="0" distR="0" wp14:anchorId="24BCBD53" wp14:editId="0F1AFDDB">
             <wp:extent cx="1409656" cy="640080"/>
             <wp:effectExtent l="0" t="0" r="635" b="7620"/>
             <wp:docPr id="2063757162" name="Imagem 1"/>
@@ -71,6 +71,39 @@
     </w:p>
     <w:p>
       <w:pPr>
+        <w:rPr>
+          <w:u w:val="single"/>
+        </w:rPr>
+      </w:pPr>
+      <w:r>
+        <w:rPr>
+          <w:b/>
+        </w:rPr>
+        <w:t>BLOG</w:t>
+      </w:r>
+      <w:r>
+        <w:rPr>
+          <w:b/>
+        </w:rPr>
+        <w:t xml:space="preserve"> DE FILMES</w:t>
+      </w:r>
+    </w:p>
+    <w:p>
+      <w:pPr>
+        <w:spacing w:after="182" w:line="259" w:lineRule="auto"/>
+        <w:ind w:left="0" w:right="0" w:firstLine="0"/>
+        <w:jc w:val="center"/>
+      </w:pPr>
+    </w:p>
+    <w:p>
+      <w:pPr>
+        <w:spacing w:after="182" w:line="259" w:lineRule="auto"/>
+        <w:ind w:left="0" w:right="0" w:firstLine="0"/>
+        <w:jc w:val="center"/>
+      </w:pPr>
+    </w:p>
+    <w:p>
+      <w:pPr>
         <w:spacing w:after="180" w:line="259" w:lineRule="auto"/>
         <w:ind w:left="10" w:right="71"/>
         <w:jc w:val="center"/>
@@ -79,33 +112,6 @@
         <w:rPr>
           <w:b/>
         </w:rPr>
-        <w:t>REDE SOCIAL DE FILMES</w:t>
-      </w:r>
-    </w:p>
-    <w:p>
-      <w:pPr>
-        <w:spacing w:after="182" w:line="259" w:lineRule="auto"/>
-        <w:ind w:left="0" w:right="0" w:firstLine="0"/>
-        <w:jc w:val="center"/>
-      </w:pPr>
-    </w:p>
-    <w:p>
-      <w:pPr>
-        <w:spacing w:after="182" w:line="259" w:lineRule="auto"/>
-        <w:ind w:left="0" w:right="0" w:firstLine="0"/>
-        <w:jc w:val="center"/>
-      </w:pPr>
-    </w:p>
-    <w:p>
-      <w:pPr>
-        <w:spacing w:after="180" w:line="259" w:lineRule="auto"/>
-        <w:ind w:left="10" w:right="71"/>
-        <w:jc w:val="center"/>
-      </w:pPr>
-      <w:r>
-        <w:rPr>
-          <w:b/>
-        </w:rPr>
         <w:t>CLIENTES</w:t>
       </w:r>
     </w:p>
@@ -336,13 +342,13 @@
         <w:rPr>
           <w:b/>
         </w:rPr>
-        <w:t>VERSÃO 0.</w:t>
-      </w:r>
-      <w:r>
-        <w:rPr>
-          <w:b/>
-        </w:rPr>
-        <w:t>1</w:t>
+        <w:t xml:space="preserve">VERSÃO </w:t>
+      </w:r>
+      <w:r>
+        <w:rPr>
+          <w:b/>
+        </w:rPr>
+        <w:t>1.0</w:t>
       </w:r>
       <w:r>
         <w:rPr>
@@ -361,7 +367,19 @@
         <w:rPr>
           <w:b/>
         </w:rPr>
-        <w:t xml:space="preserve">STATUS: Em Revisão </w:t>
+        <w:t xml:space="preserve">STATUS: </w:t>
+      </w:r>
+      <w:r>
+        <w:rPr>
+          <w:b/>
+        </w:rPr>
+        <w:t>Finalizado</w:t>
+      </w:r>
+      <w:r>
+        <w:rPr>
+          <w:b/>
+        </w:rPr>
+        <w:t xml:space="preserve"> </w:t>
       </w:r>
     </w:p>
     <w:p>
@@ -562,7 +580,13 @@
         <w:rPr>
           <w:b/>
         </w:rPr>
-        <w:t>REDE SOCIAL DE FILMES</w:t>
+        <w:t>BLOG</w:t>
+      </w:r>
+      <w:r>
+        <w:rPr>
+          <w:b/>
+        </w:rPr>
+        <w:t xml:space="preserve"> DE FILMES</w:t>
       </w:r>
     </w:p>
     <w:p>
@@ -665,7 +689,13 @@
         <w:t>Este trabalho apresenta o desenvolvimento de um</w:t>
       </w:r>
       <w:r>
-        <w:t>a rede social de filmes</w:t>
+        <w:t xml:space="preserve"> </w:t>
+      </w:r>
+      <w:r>
+        <w:t>blog</w:t>
+      </w:r>
+      <w:r>
+        <w:t xml:space="preserve"> de filmes</w:t>
       </w:r>
       <w:r>
         <w:t>.</w:t>
@@ -1040,6 +1070,13 @@
     </w:p>
     <w:p>
       <w:pPr>
+        <w:spacing w:after="182" w:line="259" w:lineRule="auto"/>
+        <w:ind w:left="0" w:right="0" w:firstLine="0"/>
+        <w:jc w:val="left"/>
+      </w:pPr>
+    </w:p>
+    <w:p>
+      <w:pPr>
         <w:spacing w:line="259" w:lineRule="auto"/>
         <w:ind w:left="0" w:right="0" w:firstLine="0"/>
         <w:jc w:val="left"/>
@@ -1060,11 +1097,219 @@
     </w:p>
     <w:p>
       <w:pPr>
-        <w:spacing w:after="218"/>
+        <w:spacing w:after="168"/>
         <w:ind w:left="10" w:right="58" w:firstLine="289"/>
       </w:pPr>
       <w:r>
-        <w:t>Conhecendo mais do tema, percebi uma lacuna, pouco se encontra informações sobre origens do cinema ou até mesmo discussões mais aprofundadas de cinema. As poucas informações que se pode encontrar é através de professores de cinema que disponibilizam materiais gratuitamente ou através de cursos pagos.</w:t>
+        <w:t>Conhecendo mais do tema, percebi uma lacuna: pouco se encontra de plataformas acessíveis que incentivem o público geral a ir além do consumo superficial de filmes, carecendo de espaços simples que unam catálogo e debate crítico.</w:t>
+      </w:r>
+      <w:r>
+        <w:rPr>
+          <w:rFonts w:ascii="Calibri" w:eastAsia="Calibri" w:hAnsi="Calibri" w:cs="Calibri"/>
+        </w:rPr>
+        <w:t xml:space="preserve"> </w:t>
+      </w:r>
+    </w:p>
+    <w:p>
+      <w:pPr>
+        <w:spacing w:after="182" w:line="259" w:lineRule="auto"/>
+        <w:ind w:left="0" w:right="0" w:firstLine="0"/>
+        <w:jc w:val="left"/>
+      </w:pPr>
+      <w:r>
+        <w:rPr>
+          <w:b/>
+        </w:rPr>
+        <w:t xml:space="preserve"> </w:t>
+      </w:r>
+    </w:p>
+    <w:p>
+      <w:pPr>
+        <w:spacing w:after="182" w:line="259" w:lineRule="auto"/>
+        <w:ind w:left="0" w:right="0" w:firstLine="0"/>
+        <w:jc w:val="left"/>
+      </w:pPr>
+      <w:r>
+        <w:t xml:space="preserve"> </w:t>
+      </w:r>
+    </w:p>
+    <w:p>
+      <w:pPr>
+        <w:spacing w:after="182" w:line="259" w:lineRule="auto"/>
+        <w:ind w:left="0" w:right="0" w:firstLine="0"/>
+        <w:jc w:val="left"/>
+      </w:pPr>
+      <w:r>
+        <w:t xml:space="preserve"> </w:t>
+      </w:r>
+    </w:p>
+    <w:p>
+      <w:pPr>
+        <w:spacing w:after="182" w:line="259" w:lineRule="auto"/>
+        <w:ind w:left="0" w:right="0" w:firstLine="0"/>
+        <w:jc w:val="left"/>
+      </w:pPr>
+      <w:r>
+        <w:t xml:space="preserve"> </w:t>
+      </w:r>
+    </w:p>
+    <w:p>
+      <w:pPr>
+        <w:spacing w:after="182" w:line="259" w:lineRule="auto"/>
+        <w:ind w:left="0" w:right="0" w:firstLine="0"/>
+        <w:jc w:val="left"/>
+      </w:pPr>
+      <w:r>
+        <w:t xml:space="preserve"> </w:t>
+      </w:r>
+    </w:p>
+    <w:p>
+      <w:pPr>
+        <w:spacing w:after="182" w:line="259" w:lineRule="auto"/>
+        <w:ind w:left="0" w:right="0" w:firstLine="0"/>
+        <w:jc w:val="left"/>
+      </w:pPr>
+      <w:r>
+        <w:t xml:space="preserve"> </w:t>
+      </w:r>
+    </w:p>
+    <w:p>
+      <w:pPr>
+        <w:spacing w:after="182" w:line="259" w:lineRule="auto"/>
+        <w:ind w:left="0" w:right="0" w:firstLine="0"/>
+        <w:jc w:val="left"/>
+      </w:pPr>
+    </w:p>
+    <w:p>
+      <w:pPr>
+        <w:spacing w:after="182" w:line="259" w:lineRule="auto"/>
+        <w:ind w:left="0" w:right="0" w:firstLine="0"/>
+        <w:jc w:val="left"/>
+      </w:pPr>
+    </w:p>
+    <w:p>
+      <w:pPr>
+        <w:spacing w:after="182" w:line="259" w:lineRule="auto"/>
+        <w:ind w:left="0" w:right="0" w:firstLine="0"/>
+        <w:jc w:val="left"/>
+      </w:pPr>
+    </w:p>
+    <w:p>
+      <w:pPr>
+        <w:spacing w:after="182" w:line="259" w:lineRule="auto"/>
+        <w:ind w:left="0" w:right="0" w:firstLine="0"/>
+        <w:jc w:val="left"/>
+      </w:pPr>
+    </w:p>
+    <w:p>
+      <w:pPr>
+        <w:spacing w:after="182" w:line="259" w:lineRule="auto"/>
+        <w:ind w:left="0" w:right="0" w:firstLine="0"/>
+        <w:jc w:val="left"/>
+      </w:pPr>
+    </w:p>
+    <w:p>
+      <w:pPr>
+        <w:spacing w:after="182" w:line="259" w:lineRule="auto"/>
+        <w:ind w:left="0" w:right="0" w:firstLine="0"/>
+        <w:jc w:val="left"/>
+      </w:pPr>
+    </w:p>
+    <w:p>
+      <w:pPr>
+        <w:spacing w:after="182" w:line="259" w:lineRule="auto"/>
+        <w:ind w:left="0" w:right="0" w:firstLine="0"/>
+        <w:jc w:val="left"/>
+      </w:pPr>
+    </w:p>
+    <w:p>
+      <w:pPr>
+        <w:spacing w:after="182" w:line="259" w:lineRule="auto"/>
+        <w:ind w:left="0" w:right="0" w:firstLine="0"/>
+        <w:jc w:val="left"/>
+      </w:pPr>
+    </w:p>
+    <w:p>
+      <w:pPr>
+        <w:spacing w:after="182" w:line="259" w:lineRule="auto"/>
+        <w:ind w:left="0" w:right="0" w:firstLine="0"/>
+        <w:jc w:val="left"/>
+      </w:pPr>
+    </w:p>
+    <w:p>
+      <w:pPr>
+        <w:spacing w:after="182" w:line="259" w:lineRule="auto"/>
+        <w:ind w:left="0" w:right="0" w:firstLine="0"/>
+        <w:jc w:val="left"/>
+      </w:pPr>
+    </w:p>
+    <w:p>
+      <w:pPr>
+        <w:spacing w:after="182" w:line="259" w:lineRule="auto"/>
+        <w:ind w:left="0" w:right="0" w:firstLine="0"/>
+        <w:jc w:val="left"/>
+      </w:pPr>
+    </w:p>
+    <w:p>
+      <w:pPr>
+        <w:spacing w:after="182" w:line="259" w:lineRule="auto"/>
+        <w:ind w:left="0" w:right="0" w:firstLine="0"/>
+        <w:jc w:val="left"/>
+      </w:pPr>
+    </w:p>
+    <w:p>
+      <w:pPr>
+        <w:spacing w:after="182" w:line="259" w:lineRule="auto"/>
+        <w:ind w:left="0" w:right="0" w:firstLine="0"/>
+        <w:jc w:val="left"/>
+      </w:pPr>
+    </w:p>
+    <w:p>
+      <w:pPr>
+        <w:spacing w:after="182" w:line="259" w:lineRule="auto"/>
+        <w:ind w:left="0" w:right="0" w:firstLine="0"/>
+        <w:jc w:val="left"/>
+      </w:pPr>
+    </w:p>
+    <w:p>
+      <w:pPr>
+        <w:spacing w:after="182" w:line="259" w:lineRule="auto"/>
+        <w:ind w:left="0" w:right="0" w:firstLine="0"/>
+        <w:jc w:val="left"/>
+      </w:pPr>
+    </w:p>
+    <w:p>
+      <w:pPr>
+        <w:spacing w:after="182" w:line="259" w:lineRule="auto"/>
+        <w:ind w:left="0" w:right="0" w:firstLine="0"/>
+        <w:jc w:val="left"/>
+      </w:pPr>
+    </w:p>
+    <w:p>
+      <w:pPr>
+        <w:spacing w:after="182" w:line="259" w:lineRule="auto"/>
+        <w:ind w:left="0" w:right="0" w:firstLine="0"/>
+        <w:jc w:val="left"/>
+      </w:pPr>
+    </w:p>
+    <w:p>
+      <w:pPr>
+        <w:spacing w:line="259" w:lineRule="auto"/>
+        <w:ind w:left="0" w:right="0" w:firstLine="0"/>
+        <w:jc w:val="left"/>
+      </w:pPr>
+      <w:r>
+        <w:t xml:space="preserve"> </w:t>
+      </w:r>
+    </w:p>
+    <w:p>
+      <w:pPr>
+        <w:pStyle w:val="Ttulo1"/>
+        <w:ind w:left="297" w:hanging="312"/>
+      </w:pPr>
+      <w:r>
+        <w:lastRenderedPageBreak/>
+        <w:t xml:space="preserve">Objetivo </w:t>
       </w:r>
     </w:p>
     <w:p>
@@ -1074,220 +1319,37 @@
       </w:pPr>
       <w:r>
         <w:rPr>
-          <w:rFonts w:ascii="Calibri" w:eastAsia="Calibri" w:hAnsi="Calibri" w:cs="Calibri"/>
-        </w:rPr>
-        <w:t xml:space="preserve"> </w:t>
-      </w:r>
-    </w:p>
-    <w:p>
-      <w:pPr>
-        <w:spacing w:after="182" w:line="259" w:lineRule="auto"/>
-        <w:ind w:left="0" w:right="0" w:firstLine="0"/>
-        <w:jc w:val="left"/>
-      </w:pPr>
-      <w:r>
-        <w:rPr>
-          <w:b/>
-        </w:rPr>
-        <w:t xml:space="preserve"> </w:t>
-      </w:r>
-    </w:p>
-    <w:p>
-      <w:pPr>
-        <w:spacing w:after="182" w:line="259" w:lineRule="auto"/>
-        <w:ind w:left="0" w:right="0" w:firstLine="0"/>
-        <w:jc w:val="left"/>
-      </w:pPr>
-      <w:r>
-        <w:t xml:space="preserve"> </w:t>
-      </w:r>
-    </w:p>
-    <w:p>
-      <w:pPr>
-        <w:spacing w:after="182" w:line="259" w:lineRule="auto"/>
-        <w:ind w:left="0" w:right="0" w:firstLine="0"/>
-        <w:jc w:val="left"/>
-      </w:pPr>
-      <w:r>
-        <w:t xml:space="preserve"> </w:t>
-      </w:r>
-    </w:p>
-    <w:p>
-      <w:pPr>
-        <w:spacing w:after="182" w:line="259" w:lineRule="auto"/>
-        <w:ind w:left="0" w:right="0" w:firstLine="0"/>
-        <w:jc w:val="left"/>
-      </w:pPr>
-      <w:r>
-        <w:t xml:space="preserve"> </w:t>
-      </w:r>
-    </w:p>
-    <w:p>
-      <w:pPr>
-        <w:spacing w:after="182" w:line="259" w:lineRule="auto"/>
-        <w:ind w:left="0" w:right="0" w:firstLine="0"/>
-        <w:jc w:val="left"/>
-      </w:pPr>
-      <w:r>
-        <w:t xml:space="preserve"> </w:t>
-      </w:r>
-    </w:p>
-    <w:p>
-      <w:pPr>
-        <w:spacing w:after="182" w:line="259" w:lineRule="auto"/>
-        <w:ind w:left="0" w:right="0" w:firstLine="0"/>
-        <w:jc w:val="left"/>
-      </w:pPr>
-      <w:r>
-        <w:t xml:space="preserve"> </w:t>
-      </w:r>
-    </w:p>
-    <w:p>
-      <w:pPr>
-        <w:spacing w:after="182" w:line="259" w:lineRule="auto"/>
-        <w:ind w:left="0" w:right="0" w:firstLine="0"/>
-        <w:jc w:val="left"/>
-      </w:pPr>
-    </w:p>
-    <w:p>
-      <w:pPr>
-        <w:spacing w:after="182" w:line="259" w:lineRule="auto"/>
-        <w:ind w:left="0" w:right="0" w:firstLine="0"/>
-        <w:jc w:val="left"/>
-      </w:pPr>
-    </w:p>
-    <w:p>
-      <w:pPr>
-        <w:spacing w:after="182" w:line="259" w:lineRule="auto"/>
-        <w:ind w:left="0" w:right="0" w:firstLine="0"/>
-        <w:jc w:val="left"/>
-      </w:pPr>
-    </w:p>
-    <w:p>
-      <w:pPr>
-        <w:spacing w:after="182" w:line="259" w:lineRule="auto"/>
-        <w:ind w:left="0" w:right="0" w:firstLine="0"/>
-        <w:jc w:val="left"/>
-      </w:pPr>
-    </w:p>
-    <w:p>
-      <w:pPr>
-        <w:spacing w:after="182" w:line="259" w:lineRule="auto"/>
-        <w:ind w:left="0" w:right="0" w:firstLine="0"/>
-        <w:jc w:val="left"/>
-      </w:pPr>
-    </w:p>
-    <w:p>
-      <w:pPr>
-        <w:spacing w:after="182" w:line="259" w:lineRule="auto"/>
-        <w:ind w:left="0" w:right="0" w:firstLine="0"/>
-        <w:jc w:val="left"/>
-      </w:pPr>
-    </w:p>
-    <w:p>
-      <w:pPr>
-        <w:spacing w:after="182" w:line="259" w:lineRule="auto"/>
-        <w:ind w:left="0" w:right="0" w:firstLine="0"/>
-        <w:jc w:val="left"/>
-      </w:pPr>
-    </w:p>
-    <w:p>
-      <w:pPr>
-        <w:spacing w:after="182" w:line="259" w:lineRule="auto"/>
-        <w:ind w:left="0" w:right="0" w:firstLine="0"/>
-        <w:jc w:val="left"/>
-      </w:pPr>
-    </w:p>
-    <w:p>
-      <w:pPr>
-        <w:spacing w:after="182" w:line="259" w:lineRule="auto"/>
-        <w:ind w:left="0" w:right="0" w:firstLine="0"/>
-        <w:jc w:val="left"/>
-      </w:pPr>
-    </w:p>
-    <w:p>
-      <w:pPr>
-        <w:spacing w:after="182" w:line="259" w:lineRule="auto"/>
-        <w:ind w:left="0" w:right="0" w:firstLine="0"/>
-        <w:jc w:val="left"/>
-      </w:pPr>
-    </w:p>
-    <w:p>
-      <w:pPr>
-        <w:spacing w:after="182" w:line="259" w:lineRule="auto"/>
-        <w:ind w:left="0" w:right="0" w:firstLine="0"/>
-        <w:jc w:val="left"/>
-      </w:pPr>
-    </w:p>
-    <w:p>
-      <w:pPr>
-        <w:spacing w:after="182" w:line="259" w:lineRule="auto"/>
-        <w:ind w:left="0" w:right="0" w:firstLine="0"/>
-        <w:jc w:val="left"/>
-      </w:pPr>
-    </w:p>
-    <w:p>
-      <w:pPr>
-        <w:spacing w:after="182" w:line="259" w:lineRule="auto"/>
-        <w:ind w:left="0" w:right="0" w:firstLine="0"/>
-        <w:jc w:val="left"/>
-      </w:pPr>
-    </w:p>
-    <w:p>
-      <w:pPr>
-        <w:spacing w:after="182" w:line="259" w:lineRule="auto"/>
-        <w:ind w:left="0" w:right="0" w:firstLine="0"/>
-        <w:jc w:val="left"/>
-      </w:pPr>
-    </w:p>
-    <w:p>
-      <w:pPr>
-        <w:spacing w:after="182" w:line="259" w:lineRule="auto"/>
-        <w:ind w:left="0" w:right="0" w:firstLine="0"/>
-        <w:jc w:val="left"/>
-      </w:pPr>
-    </w:p>
-    <w:p>
-      <w:pPr>
-        <w:spacing w:after="182" w:line="259" w:lineRule="auto"/>
-        <w:ind w:left="0" w:right="0" w:firstLine="0"/>
-        <w:jc w:val="left"/>
-      </w:pPr>
-    </w:p>
-    <w:p>
-      <w:pPr>
-        <w:spacing w:line="259" w:lineRule="auto"/>
-        <w:ind w:left="0" w:right="0" w:firstLine="0"/>
-        <w:jc w:val="left"/>
-      </w:pPr>
-      <w:r>
-        <w:t xml:space="preserve"> </w:t>
-      </w:r>
-    </w:p>
-    <w:p>
-      <w:pPr>
-        <w:pStyle w:val="Ttulo1"/>
-        <w:ind w:left="297" w:hanging="312"/>
-      </w:pPr>
-      <w:r>
-        <w:lastRenderedPageBreak/>
-        <w:t xml:space="preserve">Objetivo </w:t>
-      </w:r>
-    </w:p>
-    <w:p>
-      <w:pPr>
-        <w:spacing w:after="168"/>
-        <w:ind w:left="10" w:right="58"/>
-      </w:pPr>
-      <w:r>
-        <w:rPr>
           <w:b/>
           <w:sz w:val="28"/>
         </w:rPr>
         <w:t xml:space="preserve"> </w:t>
       </w:r>
       <w:r>
-        <w:t>Desenvolver um sistema que permita as pessoas terem um contato inicial sobre história do cinema, e incentivar conversas sobre filmes.</w:t>
+        <w:t>Desenvolver um sistema web que funcione como um</w:t>
+      </w:r>
+      <w:r>
+        <w:t xml:space="preserve"> blog de filmes, quase uma</w:t>
+      </w:r>
+      <w:r>
+        <w:t xml:space="preserve"> rede social </w:t>
+      </w:r>
+      <w:r>
+        <w:t>de filmes</w:t>
+      </w:r>
+      <w:r>
+        <w:t>, permitindo às pessoas conhecerem novos filmes</w:t>
+      </w:r>
+      <w:r>
+        <w:t>,</w:t>
+      </w:r>
+      <w:r>
+        <w:t xml:space="preserve"> interagirem</w:t>
+      </w:r>
+      <w:r>
+        <w:t xml:space="preserve"> e documentarem seus filmes favoritos </w:t>
+      </w:r>
+      <w:r>
+        <w:t>para incentivar a cultura do cinema.</w:t>
       </w:r>
     </w:p>
     <w:p>
@@ -1559,49 +1621,13 @@
     </w:p>
     <w:p>
       <w:pPr>
-        <w:spacing w:after="168"/>
-        <w:ind w:left="10" w:right="58" w:firstLine="289"/>
-      </w:pPr>
-      <w:r>
-        <w:t>A sétima arte está presente na vida todos, todo</w:t>
-      </w:r>
-      <w:r>
-        <w:t>s</w:t>
-      </w:r>
-      <w:r>
-        <w:t xml:space="preserve"> v</w:t>
-      </w:r>
-      <w:r>
-        <w:t>eem</w:t>
-      </w:r>
-      <w:r>
-        <w:t xml:space="preserve"> filmes o tempo todo, </w:t>
-      </w:r>
-      <w:r>
-        <w:t xml:space="preserve">mas poucos se aprofundam e tentam conhecer mais sobre. Muitos dizem assistir filmes apenas para se distrair, e tudo bem, não podemos ditar o modo que as pessoas consomem mídias, mas depois que se desenvolve um senso crítico sobre o tema é perceptível o tanto que se perde de informações, conteúdo, </w:t>
-      </w:r>
-      <w:r>
-        <w:t>sentido e interpretações sobre obras por não querer se aprofundar.</w:t>
-      </w:r>
-    </w:p>
-    <w:p>
-      <w:pPr>
-        <w:spacing w:after="168"/>
-        <w:ind w:left="10" w:right="58" w:firstLine="289"/>
-      </w:pPr>
-      <w:r>
-        <w:t xml:space="preserve">Com isso, se faz necessário a criação de </w:t>
-      </w:r>
-      <w:r>
-        <w:t>meios que promovam o debate aprofundado sobre filmes.</w:t>
-      </w:r>
-    </w:p>
-    <w:p>
-      <w:pPr>
-        <w:spacing w:after="182" w:line="259" w:lineRule="auto"/>
-        <w:ind w:left="0" w:right="0" w:firstLine="0"/>
-        <w:jc w:val="left"/>
-      </w:pPr>
+        <w:spacing w:after="182" w:line="259" w:lineRule="auto"/>
+        <w:ind w:left="0" w:right="0" w:firstLine="299"/>
+        <w:jc w:val="left"/>
+      </w:pPr>
+      <w:r>
+        <w:t>A sétima arte está presente na vida de todos, mas poucos tentam conhecer mais sobre ela. Muitos dizem assistir filmes apenas para se distrair, o que é válido, mas sem um senso crítico, perde-se muito conteúdo, sentido e interpretações sobre as obras. Por isso, faz-se necessária a criação de um meio que promova o debate e a troca de experiências sobre o cinema de forma simples.</w:t>
+      </w:r>
       <w:r>
         <w:t xml:space="preserve"> </w:t>
       </w:r>
@@ -1705,6 +1731,41 @@
       <w:r>
         <w:t xml:space="preserve"> </w:t>
       </w:r>
+    </w:p>
+    <w:p>
+      <w:pPr>
+        <w:spacing w:line="259" w:lineRule="auto"/>
+        <w:ind w:left="0" w:right="0" w:firstLine="0"/>
+        <w:jc w:val="left"/>
+      </w:pPr>
+    </w:p>
+    <w:p>
+      <w:pPr>
+        <w:spacing w:line="259" w:lineRule="auto"/>
+        <w:ind w:left="0" w:right="0" w:firstLine="0"/>
+        <w:jc w:val="left"/>
+      </w:pPr>
+    </w:p>
+    <w:p>
+      <w:pPr>
+        <w:spacing w:line="259" w:lineRule="auto"/>
+        <w:ind w:left="0" w:right="0" w:firstLine="0"/>
+        <w:jc w:val="left"/>
+      </w:pPr>
+    </w:p>
+    <w:p>
+      <w:pPr>
+        <w:spacing w:line="259" w:lineRule="auto"/>
+        <w:ind w:left="0" w:right="0" w:firstLine="0"/>
+        <w:jc w:val="left"/>
+      </w:pPr>
+    </w:p>
+    <w:p>
+      <w:pPr>
+        <w:spacing w:line="259" w:lineRule="auto"/>
+        <w:ind w:left="0" w:right="0" w:firstLine="0"/>
+        <w:jc w:val="left"/>
+      </w:pPr>
     </w:p>
     <w:p>
       <w:pPr>
@@ -1830,32 +1891,13 @@
     </w:p>
     <w:p>
       <w:pPr>
-        <w:ind w:left="0" w:firstLine="299"/>
-      </w:pPr>
-      <w:r>
-        <w:t xml:space="preserve">Criar uma rede social sobre filmes, que promova o debate </w:t>
-      </w:r>
-      <w:r>
-        <w:t>sobre cinema. Esta rede social incluirá uma página que introduza sobre a história do cinema, uma página com 16 filmes escolhidos pelo desenvolvedor, onde cada um terá uma página própria com informações básicas, seção de comentários próprio e um quiz próprio.</w:t>
-      </w:r>
-    </w:p>
-    <w:p>
-      <w:pPr>
-        <w:ind w:left="0" w:firstLine="299"/>
-        <w:rPr>
-          <w:szCs w:val="28"/>
-        </w:rPr>
-      </w:pPr>
-      <w:r>
-        <w:t>O usuário só poderá comentar e fazer um quiz de um filme ao ter uma conta cadastrada e estar conectado a esta conta. Com isso ele poderá ter acesso a tudo no site e interagir com outras contas.</w:t>
-      </w:r>
-    </w:p>
-    <w:p>
-      <w:pPr>
         <w:spacing w:after="193" w:line="259" w:lineRule="auto"/>
-        <w:ind w:left="0" w:right="0" w:firstLine="0"/>
-        <w:jc w:val="left"/>
-      </w:pPr>
+        <w:ind w:left="0" w:right="0" w:firstLine="299"/>
+        <w:jc w:val="left"/>
+      </w:pPr>
+      <w:r>
+        <w:t>Criar uma plataforma web sobre filmes que promova o debate sobre cinema. O sistema incluirá uma página principal com 16 filmes selecionados pelo desenvolvedor. O usuário só poderá interagir com os filmes após se cadastrar e realizar o login.</w:t>
+      </w:r>
       <w:r>
         <w:rPr>
           <w:b/>
@@ -1874,26 +1916,21 @@
     </w:p>
     <w:p>
       <w:pPr>
-        <w:spacing w:after="148" w:line="259" w:lineRule="auto"/>
-        <w:ind w:left="0" w:right="0" w:firstLine="0"/>
-        <w:jc w:val="left"/>
-      </w:pPr>
-      <w:r>
-        <w:rPr>
-          <w:b/>
-          <w:sz w:val="28"/>
-        </w:rPr>
-        <w:t xml:space="preserve"> </w:t>
-      </w:r>
-    </w:p>
-    <w:p>
-      <w:pPr>
-        <w:spacing w:after="182" w:line="259" w:lineRule="auto"/>
-        <w:ind w:left="0" w:right="0" w:firstLine="0"/>
-        <w:jc w:val="left"/>
-      </w:pPr>
-      <w:r>
-        <w:t xml:space="preserve"> </w:t>
+        <w:spacing w:after="182" w:line="259" w:lineRule="auto"/>
+        <w:ind w:left="0" w:right="0" w:firstLine="0"/>
+        <w:jc w:val="left"/>
+      </w:pPr>
+      <w:r>
+        <w:t xml:space="preserve"> </w:t>
+      </w:r>
+    </w:p>
+    <w:p>
+      <w:pPr>
+        <w:pStyle w:val="Ttulo2"/>
+        <w:ind w:left="388" w:right="0" w:hanging="403"/>
+      </w:pPr>
+      <w:r>
+        <w:t>Descrição resumida do projeto</w:t>
       </w:r>
     </w:p>
     <w:p>
@@ -1903,8 +1940,83 @@
         <w:jc w:val="left"/>
       </w:pPr>
       <w:r>
-        <w:t xml:space="preserve"> </w:t>
-      </w:r>
+        <w:t xml:space="preserve">O projeto consiste em um site de catálogo e interação cinematográfica, focado em uma curadoria de 16 filmes (como </w:t>
+      </w:r>
+      <w:proofErr w:type="spellStart"/>
+      <w:r>
+        <w:t>Blade</w:t>
+      </w:r>
+      <w:proofErr w:type="spellEnd"/>
+      <w:r>
+        <w:t xml:space="preserve"> </w:t>
+      </w:r>
+      <w:proofErr w:type="spellStart"/>
+      <w:r>
+        <w:t>Runner</w:t>
+      </w:r>
+      <w:proofErr w:type="spellEnd"/>
+      <w:r>
+        <w:t>, Akira e 2001: Uma Odisseia no Espaço), onde usuários conectados podem acessar informações detalhadas e debater sobre as obras.</w:t>
+      </w:r>
+    </w:p>
+    <w:p>
+      <w:pPr>
+        <w:spacing w:line="259" w:lineRule="auto"/>
+        <w:ind w:left="0" w:right="0" w:firstLine="0"/>
+        <w:jc w:val="left"/>
+      </w:pPr>
+    </w:p>
+    <w:p>
+      <w:pPr>
+        <w:spacing w:line="259" w:lineRule="auto"/>
+        <w:ind w:left="0" w:right="0" w:firstLine="0"/>
+        <w:jc w:val="left"/>
+      </w:pPr>
+    </w:p>
+    <w:p>
+      <w:pPr>
+        <w:pStyle w:val="Ttulo2"/>
+        <w:ind w:left="388" w:right="0" w:hanging="403"/>
+      </w:pPr>
+      <w:r>
+        <w:t>Re</w:t>
+      </w:r>
+      <w:r>
+        <w:t>sultado esperado</w:t>
+      </w:r>
+      <w:r>
+        <w:t xml:space="preserve"> </w:t>
+      </w:r>
+    </w:p>
+    <w:p>
+      <w:pPr>
+        <w:spacing w:line="259" w:lineRule="auto"/>
+        <w:ind w:left="0" w:right="0" w:firstLine="388"/>
+        <w:jc w:val="left"/>
+      </w:pPr>
+      <w:r>
+        <w:t xml:space="preserve">Espera-se entregar uma aplicação web funcional, com design </w:t>
+      </w:r>
+      <w:r>
+        <w:t>que remeta a cinema</w:t>
+      </w:r>
+      <w:r>
+        <w:t>, que armazene de forma segura os dados dos usuários e permita uma navegação fluida entre o catálogo e as páginas de detalhes dos filmes.</w:t>
+      </w:r>
+    </w:p>
+    <w:p>
+      <w:pPr>
+        <w:spacing w:line="259" w:lineRule="auto"/>
+        <w:ind w:left="0" w:right="0" w:firstLine="388"/>
+        <w:jc w:val="left"/>
+      </w:pPr>
+    </w:p>
+    <w:p>
+      <w:pPr>
+        <w:spacing w:line="259" w:lineRule="auto"/>
+        <w:ind w:left="0" w:right="0" w:firstLine="0"/>
+        <w:jc w:val="left"/>
+      </w:pPr>
     </w:p>
     <w:p>
       <w:pPr>
@@ -1965,7 +2077,13 @@
         <w:t>Criar p</w:t>
       </w:r>
       <w:r>
-        <w:t>ágina de início, onde terá os 16 filmes selecionados.</w:t>
+        <w:t xml:space="preserve">ágina de início, onde terá os 16 filmes </w:t>
+      </w:r>
+      <w:r>
+        <w:t>principais</w:t>
+      </w:r>
+      <w:r>
+        <w:t>.</w:t>
       </w:r>
     </w:p>
     <w:p>
@@ -1980,7 +2098,7 @@
         <w:t>Criar p</w:t>
       </w:r>
       <w:r>
-        <w:t>ágina de história do cinema, onde terá um panorama simples da história do cinema e indicações de aprofundamento.</w:t>
+        <w:t>ágina de Cadastro</w:t>
       </w:r>
     </w:p>
     <w:p>
@@ -1995,7 +2113,7 @@
         <w:t>Criar p</w:t>
       </w:r>
       <w:r>
-        <w:t>ágina de Cadastro</w:t>
+        <w:t>ágina de Login</w:t>
       </w:r>
     </w:p>
     <w:p>
@@ -2010,7 +2128,16 @@
         <w:t>Criar p</w:t>
       </w:r>
       <w:r>
-        <w:t>ágina de Login</w:t>
+        <w:t xml:space="preserve">ágina de filme, onde terá informações do filme, </w:t>
+      </w:r>
+      <w:r>
+        <w:t>como, ano, duração, sinopse e diretor</w:t>
+      </w:r>
+      <w:r>
+        <w:t>. E o usuário poderá interagir com o filme</w:t>
+      </w:r>
+      <w:r>
+        <w:t>.</w:t>
       </w:r>
     </w:p>
     <w:p>
@@ -2022,152 +2149,540 @@
         </w:numPr>
       </w:pPr>
       <w:r>
-        <w:t>Criar p</w:t>
-      </w:r>
-      <w:r>
-        <w:t>ágina de filme, onde terá informações do filme, seção de comentários, e quiz.</w:t>
-      </w:r>
-    </w:p>
-    <w:p>
-      <w:pPr>
-        <w:spacing w:after="159" w:line="278" w:lineRule="auto"/>
-        <w:ind w:left="345" w:right="24" w:firstLine="338"/>
-        <w:jc w:val="left"/>
-      </w:pPr>
-    </w:p>
-    <w:p>
-      <w:pPr>
-        <w:spacing w:after="181" w:line="259" w:lineRule="auto"/>
-        <w:ind w:left="-5" w:right="0"/>
-        <w:jc w:val="left"/>
-      </w:pPr>
-      <w:r>
-        <w:rPr>
-          <w:b/>
-        </w:rPr>
-        <w:t xml:space="preserve">5.5 Macro cronograma** </w:t>
-      </w:r>
-    </w:p>
-    <w:p>
-      <w:pPr>
-        <w:spacing w:after="181" w:line="259" w:lineRule="auto"/>
-        <w:ind w:left="-5" w:right="0"/>
-        <w:jc w:val="left"/>
-      </w:pPr>
-      <w:r>
-        <w:rPr>
-          <w:b/>
-        </w:rPr>
-        <w:t xml:space="preserve">5.6 Recursos necessários** </w:t>
-      </w:r>
-    </w:p>
-    <w:p>
-      <w:pPr>
-        <w:spacing w:after="181" w:line="259" w:lineRule="auto"/>
-        <w:ind w:left="-5" w:right="0"/>
-        <w:jc w:val="left"/>
-      </w:pPr>
-      <w:r>
-        <w:rPr>
-          <w:b/>
-        </w:rPr>
-        <w:t xml:space="preserve">5.7 Risco e Restrições** </w:t>
-      </w:r>
-    </w:p>
-    <w:p>
-      <w:pPr>
-        <w:spacing w:after="181" w:line="259" w:lineRule="auto"/>
-        <w:ind w:left="-5" w:right="0"/>
-        <w:jc w:val="left"/>
-      </w:pPr>
-      <w:r>
-        <w:rPr>
-          <w:b/>
-        </w:rPr>
-        <w:t xml:space="preserve">5.8 Stakeholders** </w:t>
-      </w:r>
-    </w:p>
-    <w:p>
-      <w:pPr>
+        <w:t xml:space="preserve">Criar página de </w:t>
+      </w:r>
+      <w:r>
+        <w:t>Diário, onde terá todas as interações do usuário por ordem data</w:t>
+      </w:r>
+    </w:p>
+    <w:p>
+      <w:pPr>
+        <w:pStyle w:val="PargrafodaLista"/>
         <w:numPr>
           <w:ilvl w:val="0"/>
-          <w:numId w:val="3"/>
+          <w:numId w:val="6"/>
         </w:numPr>
-        <w:spacing w:after="181" w:line="259" w:lineRule="auto"/>
-        <w:ind w:right="0" w:hanging="268"/>
-        <w:jc w:val="left"/>
-      </w:pPr>
-      <w:r>
-        <w:rPr>
-          <w:b/>
-        </w:rPr>
-        <w:t xml:space="preserve">Diagrama de solução** </w:t>
-      </w:r>
-    </w:p>
-    <w:p>
-      <w:pPr>
+      </w:pPr>
+      <w:r>
+        <w:t>Criar página de Estatísticas do usuário, que servirá como uma dashboard para ele ver dados dele mesmo sobre os filmes que ele assiste.</w:t>
+      </w:r>
+    </w:p>
+    <w:p>
+      <w:pPr>
+        <w:pStyle w:val="PargrafodaLista"/>
         <w:numPr>
           <w:ilvl w:val="0"/>
-          <w:numId w:val="3"/>
+          <w:numId w:val="6"/>
         </w:numPr>
-        <w:spacing w:after="181" w:line="259" w:lineRule="auto"/>
-        <w:ind w:right="0" w:hanging="268"/>
-        <w:jc w:val="left"/>
-      </w:pPr>
-      <w:r>
-        <w:rPr>
-          <w:b/>
-        </w:rPr>
-        <w:t xml:space="preserve">Premissas ** </w:t>
-      </w:r>
-    </w:p>
-    <w:p>
-      <w:pPr>
-        <w:pStyle w:val="Ttulo2"/>
+      </w:pPr>
+      <w:r>
+        <w:t xml:space="preserve">Criar página de </w:t>
+      </w:r>
+      <w:r>
+        <w:t>Configurações, onde o usuário poderá alterar informações do seu perfil.</w:t>
+      </w:r>
+    </w:p>
+    <w:p>
+      <w:pPr>
+        <w:pStyle w:val="PargrafodaLista"/>
         <w:numPr>
           <w:ilvl w:val="0"/>
-          <w:numId w:val="0"/>
+          <w:numId w:val="6"/>
         </w:numPr>
-        <w:ind w:left="-5" w:right="0"/>
-      </w:pPr>
-      <w:r>
-        <w:t xml:space="preserve">8.Restrições ** </w:t>
-      </w:r>
-    </w:p>
-    <w:p>
-      <w:pPr>
-        <w:spacing w:after="182" w:line="259" w:lineRule="auto"/>
-        <w:ind w:left="0" w:right="0" w:firstLine="0"/>
-        <w:jc w:val="left"/>
-      </w:pPr>
-      <w:r>
-        <w:rPr>
-          <w:b/>
-        </w:rPr>
-        <w:t xml:space="preserve"> </w:t>
-      </w:r>
-    </w:p>
-    <w:p>
-      <w:pPr>
-        <w:spacing w:after="182" w:line="259" w:lineRule="auto"/>
-        <w:ind w:left="0" w:right="0" w:firstLine="0"/>
-        <w:jc w:val="left"/>
-      </w:pPr>
-      <w:r>
-        <w:rPr>
-          <w:b/>
-        </w:rPr>
-        <w:t xml:space="preserve"> </w:t>
-      </w:r>
-    </w:p>
-    <w:p>
-      <w:pPr>
-        <w:spacing w:after="182" w:line="259" w:lineRule="auto"/>
-        <w:ind w:left="360" w:right="0" w:firstLine="0"/>
-        <w:jc w:val="left"/>
-      </w:pPr>
-      <w:r>
-        <w:t xml:space="preserve"> </w:t>
+      </w:pPr>
+      <w:r>
+        <w:t xml:space="preserve">Criar página de </w:t>
+      </w:r>
+      <w:r>
+        <w:t>Administrador, onde terá a dashboard do administrador</w:t>
+      </w:r>
+    </w:p>
+    <w:p>
+      <w:pPr>
+        <w:pStyle w:val="PargrafodaLista"/>
+        <w:numPr>
+          <w:ilvl w:val="0"/>
+          <w:numId w:val="6"/>
+        </w:numPr>
+      </w:pPr>
+      <w:r>
+        <w:t>Criar página d</w:t>
+      </w:r>
+      <w:r>
+        <w:t>e Administrador, onde poderá ser cadastrado um novo filme no banco de dados.</w:t>
+      </w:r>
+    </w:p>
+    <w:p>
+      <w:pPr>
+        <w:pStyle w:val="PargrafodaLista"/>
+        <w:ind w:firstLine="0"/>
+      </w:pPr>
+    </w:p>
+    <w:p>
+      <w:pPr>
+        <w:pStyle w:val="PargrafodaLista"/>
+        <w:ind w:firstLine="0"/>
+      </w:pPr>
+    </w:p>
+    <w:p>
+      <w:pPr>
+        <w:pStyle w:val="PargrafodaLista"/>
+        <w:ind w:firstLine="0"/>
+      </w:pPr>
+    </w:p>
+    <w:p>
+      <w:pPr>
+        <w:pStyle w:val="PargrafodaLista"/>
+        <w:ind w:firstLine="0"/>
+      </w:pPr>
+    </w:p>
+    <w:p/>
+    <w:p/>
+    <w:p>
+      <w:pPr>
+        <w:spacing w:after="182" w:line="259" w:lineRule="auto"/>
+        <w:ind w:left="0" w:right="0" w:firstLine="0"/>
+        <w:jc w:val="left"/>
+        <w:rPr>
+          <w:b/>
+        </w:rPr>
+      </w:pPr>
+      <w:r>
+        <w:rPr>
+          <w:b/>
+        </w:rPr>
+        <w:lastRenderedPageBreak/>
+        <w:t>5.4 Limites e exclusões</w:t>
+      </w:r>
+    </w:p>
+    <w:p>
+      <w:pPr>
+        <w:spacing w:after="182" w:line="259" w:lineRule="auto"/>
+        <w:ind w:left="0" w:right="0" w:firstLine="0"/>
+        <w:jc w:val="left"/>
+        <w:rPr>
+          <w:bCs/>
+        </w:rPr>
+      </w:pPr>
+      <w:r>
+        <w:rPr>
+          <w:bCs/>
+        </w:rPr>
+        <w:t>O projeto limita-se ao desenvolvimento de uma plataforma com acesso exclusivamente via interface web para computadores</w:t>
+      </w:r>
+      <w:r>
+        <w:rPr>
+          <w:bCs/>
+        </w:rPr>
+        <w:t xml:space="preserve"> </w:t>
+      </w:r>
+      <w:r>
+        <w:rPr>
+          <w:bCs/>
+        </w:rPr>
+        <w:t>não contemplando o desenvolvimento de aplicativos móveis nativos (Android/iOS).</w:t>
+      </w:r>
+    </w:p>
+    <w:p>
+      <w:pPr>
+        <w:spacing w:after="182" w:line="259" w:lineRule="auto"/>
+        <w:ind w:left="0" w:right="0" w:firstLine="0"/>
+        <w:jc w:val="left"/>
+        <w:rPr>
+          <w:bCs/>
+        </w:rPr>
+      </w:pPr>
+      <w:r>
+        <w:rPr>
+          <w:bCs/>
+        </w:rPr>
+        <w:t xml:space="preserve">Estão explicitamente excluídos do escopo: integração com APIs externas de terceiros (como </w:t>
+      </w:r>
+      <w:proofErr w:type="spellStart"/>
+      <w:r>
+        <w:rPr>
+          <w:bCs/>
+        </w:rPr>
+        <w:t>IMDb</w:t>
+      </w:r>
+      <w:proofErr w:type="spellEnd"/>
+      <w:r>
+        <w:rPr>
+          <w:bCs/>
+        </w:rPr>
+        <w:t>) nesta fase inicial, e qualquer funcionalidade de streaming ou reprodução de vídeo dos filmes.</w:t>
+      </w:r>
+    </w:p>
+    <w:p>
+      <w:pPr>
+        <w:spacing w:after="182" w:line="259" w:lineRule="auto"/>
+        <w:ind w:left="0" w:right="0" w:firstLine="0"/>
+        <w:jc w:val="left"/>
+        <w:rPr>
+          <w:bCs/>
+        </w:rPr>
+      </w:pPr>
+    </w:p>
+    <w:p>
+      <w:pPr>
+        <w:spacing w:after="182" w:line="259" w:lineRule="auto"/>
+        <w:ind w:left="0" w:right="0" w:firstLine="0"/>
+        <w:jc w:val="left"/>
+        <w:rPr>
+          <w:b/>
+        </w:rPr>
+      </w:pPr>
+      <w:r>
+        <w:rPr>
+          <w:b/>
+        </w:rPr>
+        <w:t>5.</w:t>
+      </w:r>
+      <w:r>
+        <w:rPr>
+          <w:b/>
+        </w:rPr>
+        <w:t>5</w:t>
+      </w:r>
+      <w:r>
+        <w:rPr>
+          <w:b/>
+        </w:rPr>
+        <w:t xml:space="preserve"> </w:t>
+      </w:r>
+      <w:r>
+        <w:rPr>
+          <w:b/>
+        </w:rPr>
+        <w:t>Macro Cronograma</w:t>
+      </w:r>
+    </w:p>
+    <w:p>
+      <w:pPr>
+        <w:spacing w:after="182" w:line="259" w:lineRule="auto"/>
+        <w:ind w:left="0" w:right="0" w:firstLine="360"/>
+        <w:jc w:val="left"/>
+        <w:rPr>
+          <w:bCs/>
+        </w:rPr>
+      </w:pPr>
+      <w:r>
+        <w:rPr>
+          <w:bCs/>
+        </w:rPr>
+        <w:t>O projeto será desenvolvido em etapas ao longo de aproximadamente 12 semanas:</w:t>
+      </w:r>
+    </w:p>
+    <w:p>
+      <w:pPr>
+        <w:numPr>
+          <w:ilvl w:val="0"/>
+          <w:numId w:val="7"/>
+        </w:numPr>
+        <w:spacing w:after="182" w:line="259" w:lineRule="auto"/>
+        <w:ind w:right="0"/>
+        <w:jc w:val="left"/>
+        <w:rPr>
+          <w:bCs/>
+        </w:rPr>
+      </w:pPr>
+      <w:r>
+        <w:rPr>
+          <w:b/>
+          <w:bCs/>
+        </w:rPr>
+        <w:t>Semanas 1-3:</w:t>
+      </w:r>
+      <w:r>
+        <w:rPr>
+          <w:bCs/>
+        </w:rPr>
+        <w:t xml:space="preserve"> Planejamento, definição de requisitos e prototipação das telas</w:t>
+      </w:r>
+      <w:r>
+        <w:rPr>
+          <w:bCs/>
+        </w:rPr>
+        <w:t>.</w:t>
+      </w:r>
+    </w:p>
+    <w:p>
+      <w:pPr>
+        <w:numPr>
+          <w:ilvl w:val="0"/>
+          <w:numId w:val="7"/>
+        </w:numPr>
+        <w:spacing w:after="182" w:line="259" w:lineRule="auto"/>
+        <w:ind w:right="0"/>
+        <w:jc w:val="left"/>
+        <w:rPr>
+          <w:bCs/>
+        </w:rPr>
+      </w:pPr>
+      <w:r>
+        <w:rPr>
+          <w:b/>
+          <w:bCs/>
+        </w:rPr>
+        <w:t>Semanas 4-6:</w:t>
+      </w:r>
+      <w:r>
+        <w:rPr>
+          <w:bCs/>
+        </w:rPr>
+        <w:t xml:space="preserve"> Modelagem e criação do banco de dados MySQL e configuração do ambiente.</w:t>
+      </w:r>
+    </w:p>
+    <w:p>
+      <w:pPr>
+        <w:numPr>
+          <w:ilvl w:val="0"/>
+          <w:numId w:val="7"/>
+        </w:numPr>
+        <w:spacing w:after="182" w:line="259" w:lineRule="auto"/>
+        <w:ind w:right="0"/>
+        <w:jc w:val="left"/>
+        <w:rPr>
+          <w:bCs/>
+        </w:rPr>
+      </w:pPr>
+      <w:r>
+        <w:rPr>
+          <w:b/>
+          <w:bCs/>
+        </w:rPr>
+        <w:t>Semanas 7-10:</w:t>
+      </w:r>
+      <w:r>
+        <w:rPr>
+          <w:bCs/>
+        </w:rPr>
+        <w:t xml:space="preserve"> Desenvolvimento do </w:t>
+      </w:r>
+      <w:proofErr w:type="spellStart"/>
+      <w:r>
+        <w:rPr>
+          <w:bCs/>
+        </w:rPr>
+        <w:t>frontend</w:t>
+      </w:r>
+      <w:proofErr w:type="spellEnd"/>
+      <w:r>
+        <w:rPr>
+          <w:bCs/>
+        </w:rPr>
+        <w:t xml:space="preserve"> (HTML/CSS/</w:t>
+      </w:r>
+      <w:proofErr w:type="spellStart"/>
+      <w:r>
+        <w:rPr>
+          <w:bCs/>
+        </w:rPr>
+        <w:t>JavaScript</w:t>
+      </w:r>
+      <w:proofErr w:type="spellEnd"/>
+      <w:r>
+        <w:rPr>
+          <w:bCs/>
+        </w:rPr>
+        <w:t xml:space="preserve">) e do </w:t>
+      </w:r>
+      <w:proofErr w:type="spellStart"/>
+      <w:r>
+        <w:rPr>
+          <w:bCs/>
+        </w:rPr>
+        <w:t>backend</w:t>
+      </w:r>
+      <w:proofErr w:type="spellEnd"/>
+      <w:r>
+        <w:rPr>
+          <w:bCs/>
+        </w:rPr>
+        <w:t xml:space="preserve"> para regras de cadastro, login e exibição dos filmes.</w:t>
+      </w:r>
+    </w:p>
+    <w:p>
+      <w:pPr>
+        <w:numPr>
+          <w:ilvl w:val="0"/>
+          <w:numId w:val="7"/>
+        </w:numPr>
+        <w:spacing w:after="182" w:line="259" w:lineRule="auto"/>
+        <w:ind w:right="0"/>
+        <w:jc w:val="left"/>
+        <w:rPr>
+          <w:bCs/>
+        </w:rPr>
+      </w:pPr>
+      <w:r>
+        <w:rPr>
+          <w:b/>
+          <w:bCs/>
+        </w:rPr>
+        <w:t>Semanas 11-12:</w:t>
+      </w:r>
+      <w:r>
+        <w:rPr>
+          <w:bCs/>
+        </w:rPr>
+        <w:t xml:space="preserve"> Testes de usabilidade, integração banco-aplicação e finalização da documentação.</w:t>
+      </w:r>
+    </w:p>
+    <w:p>
+      <w:pPr>
+        <w:spacing w:after="182" w:line="259" w:lineRule="auto"/>
+        <w:ind w:right="0"/>
+        <w:jc w:val="left"/>
+        <w:rPr>
+          <w:bCs/>
+        </w:rPr>
+      </w:pPr>
+    </w:p>
+    <w:p>
+      <w:pPr>
+        <w:spacing w:after="182" w:line="259" w:lineRule="auto"/>
+        <w:ind w:right="0"/>
+        <w:jc w:val="left"/>
+        <w:rPr>
+          <w:bCs/>
+        </w:rPr>
+      </w:pPr>
+    </w:p>
+    <w:p>
+      <w:pPr>
+        <w:spacing w:after="182" w:line="259" w:lineRule="auto"/>
+        <w:ind w:left="0" w:right="0" w:firstLine="0"/>
+        <w:jc w:val="left"/>
+        <w:rPr>
+          <w:bCs/>
+        </w:rPr>
+      </w:pPr>
+      <w:r>
+        <w:rPr>
+          <w:b/>
+        </w:rPr>
+        <w:t>5.6 Recursos necessários</w:t>
+      </w:r>
+    </w:p>
+    <w:p>
+      <w:pPr>
+        <w:spacing w:after="182" w:line="259" w:lineRule="auto"/>
+        <w:ind w:left="0" w:right="0" w:firstLine="0"/>
+        <w:jc w:val="left"/>
+        <w:rPr>
+          <w:bCs/>
+        </w:rPr>
+      </w:pPr>
+      <w:r>
+        <w:rPr>
+          <w:b/>
+          <w:bCs/>
+        </w:rPr>
+        <w:t>Recursos Humanos:</w:t>
+      </w:r>
+      <w:r>
+        <w:rPr>
+          <w:bCs/>
+        </w:rPr>
+        <w:t xml:space="preserve"> Desenvolvedor responsável por toda a arquitetura, design e código do sistema.</w:t>
+      </w:r>
+    </w:p>
+    <w:p>
+      <w:pPr>
+        <w:spacing w:after="182" w:line="259" w:lineRule="auto"/>
+        <w:ind w:left="0" w:right="0" w:firstLine="0"/>
+        <w:jc w:val="left"/>
+        <w:rPr>
+          <w:bCs/>
+        </w:rPr>
+      </w:pPr>
+      <w:r>
+        <w:rPr>
+          <w:b/>
+          <w:bCs/>
+        </w:rPr>
+        <w:t>Recursos Tecnológicos:</w:t>
+      </w:r>
+      <w:r>
+        <w:rPr>
+          <w:bCs/>
+        </w:rPr>
+        <w:t xml:space="preserve"> MySQL (banco de dados), Visual Studio </w:t>
+      </w:r>
+      <w:proofErr w:type="spellStart"/>
+      <w:r>
+        <w:rPr>
+          <w:bCs/>
+        </w:rPr>
+        <w:t>Code</w:t>
+      </w:r>
+      <w:proofErr w:type="spellEnd"/>
+      <w:r>
+        <w:rPr>
+          <w:bCs/>
+        </w:rPr>
+        <w:t xml:space="preserve"> (ambiente de desenvolvimento), GitHub (versionamento), HTML5, CSS3 e </w:t>
+      </w:r>
+      <w:proofErr w:type="spellStart"/>
+      <w:r>
+        <w:rPr>
+          <w:bCs/>
+        </w:rPr>
+        <w:t>JavaScript</w:t>
+      </w:r>
+      <w:proofErr w:type="spellEnd"/>
+      <w:r>
+        <w:rPr>
+          <w:bCs/>
+        </w:rPr>
+        <w:t>.</w:t>
+      </w:r>
+    </w:p>
+    <w:p>
+      <w:pPr>
+        <w:spacing w:after="182" w:line="259" w:lineRule="auto"/>
+        <w:ind w:left="0" w:right="0" w:firstLine="0"/>
+        <w:jc w:val="left"/>
+        <w:rPr>
+          <w:bCs/>
+        </w:rPr>
+      </w:pPr>
+      <w:r>
+        <w:rPr>
+          <w:b/>
+          <w:bCs/>
+        </w:rPr>
+        <w:t>Recursos Materiais:</w:t>
+      </w:r>
+      <w:r>
+        <w:rPr>
+          <w:bCs/>
+        </w:rPr>
+        <w:t xml:space="preserve"> Computador/Notebook para desenvolvimento e testes.</w:t>
+      </w:r>
+    </w:p>
+    <w:p>
+      <w:pPr>
+        <w:spacing w:after="182" w:line="259" w:lineRule="auto"/>
+        <w:ind w:left="0" w:right="0" w:firstLine="0"/>
+        <w:jc w:val="left"/>
+        <w:rPr>
+          <w:bCs/>
+        </w:rPr>
+      </w:pPr>
+      <w:r>
+        <w:rPr>
+          <w:b/>
+          <w:bCs/>
+        </w:rPr>
+        <w:t>Recursos Financeiros:</w:t>
+      </w:r>
+      <w:r>
+        <w:rPr>
+          <w:bCs/>
+        </w:rPr>
+        <w:t xml:space="preserve"> Custo zero (R$ 0,00), utilizando apenas ferramentas gratuitas e de uso acadêmico.</w:t>
       </w:r>
     </w:p>
     <w:p>
@@ -2197,7 +2712,6 @@
         <w:jc w:val="left"/>
       </w:pPr>
       <w:r>
-        <w:lastRenderedPageBreak/>
         <w:t xml:space="preserve"> </w:t>
       </w:r>
     </w:p>
@@ -2240,6 +2754,155 @@
 <file path=word/numbering.xml><?xml version="1.0" encoding="utf-8"?>
 <w:numbering xmlns:wpc="http://schemas.microsoft.com/office/word/2010/wordprocessingCanvas" xmlns:cx="http://schemas.microsoft.com/office/drawing/2014/chartex" xmlns:cx1="http://schemas.microsoft.com/office/drawing/2015/9/8/chartex" xmlns:cx2="http://schemas.microsoft.com/office/drawing/2015/10/21/chartex" xmlns:cx3="http://schemas.microsoft.com/office/drawing/2016/5/9/chartex" xmlns:cx4="http://schemas.microsoft.com/office/drawing/2016/5/10/chartex" xmlns:cx5="http://schemas.microsoft.com/office/drawing/2016/5/11/chartex" xmlns:cx6="http://schemas.microsoft.com/office/drawing/2016/5/12/chartex" xmlns:cx7="http://schemas.microsoft.com/office/drawing/2016/5/13/chartex" xmlns:cx8="http://schemas.microsoft.com/office/drawing/2016/5/14/chartex" xmlns:mc="http://schemas.openxmlformats.org/markup-compatibility/2006" xmlns:aink="http://schemas.microsoft.com/office/drawing/2016/ink" xmlns:am3d="http://schemas.microsoft.com/office/drawing/2017/model3d" xmlns:o="urn:schemas-microsoft-com:office:office" xmlns:oel="http://schemas.microsoft.com/office/2019/extlst" xmlns:r="http://schemas.openxmlformats.org/officeDocument/2006/relationships" xmlns:m="http://schemas.openxmlformats.org/officeDocument/2006/math" xmlns:v="urn:schemas-microsoft-com:vml" xmlns:wp14="http://schemas.microsoft.com/office/word/2010/wordprocessingDrawing" xmlns:wp="http://schemas.openxmlformats.org/drawingml/2006/wordprocessingDrawing" xmlns:w10="urn:schemas-microsoft-com:office:word" xmlns:w="http://schemas.openxmlformats.org/wordprocessingml/2006/main" xmlns:w14="http://schemas.microsoft.com/office/word/2010/wordml" xmlns:w15="http://schemas.microsoft.com/office/word/2012/wordml" xmlns:w16cex="http://schemas.microsoft.com/office/word/2018/wordml/cex" xmlns:w16cid="http://schemas.microsoft.com/office/word/2016/wordml/cid" xmlns:w16="http://schemas.microsoft.com/office/word/2018/wordml" xmlns:w16du="http://schemas.microsoft.com/office/word/2023/wordml/word16du" xmlns:w16sdtdh="http://schemas.microsoft.com/office/word/2020/wordml/sdtdatahash" xmlns:w16sdtfl="http://schemas.microsoft.com/office/word/2024/wordml/sdtformatlock" xmlns:w16se="http://schemas.microsoft.com/office/word/2015/wordml/symex" xmlns:wpg="http://schemas.microsoft.com/office/word/2010/wordprocessingGroup" xmlns:wpi="http://schemas.microsoft.com/office/word/2010/wordprocessingInk" xmlns:wne="http://schemas.microsoft.com/office/word/2006/wordml" xmlns:wps="http://schemas.microsoft.com/office/word/2010/wordprocessingShape" mc:Ignorable="w14 w15 w16se w16cid w16 w16cex w16sdtdh w16sdtfl w16du wp14">
   <w:abstractNum w:abstractNumId="0" w15:restartNumberingAfterBreak="0">
+    <w:nsid w:val="0648196F"/>
+    <w:multiLevelType w:val="multilevel"/>
+    <w:tmpl w:val="DE561BDA"/>
+    <w:lvl w:ilvl="0">
+      <w:start w:val="1"/>
+      <w:numFmt w:val="bullet"/>
+      <w:lvlText w:val=""/>
+      <w:lvlJc w:val="left"/>
+      <w:pPr>
+        <w:tabs>
+          <w:tab w:val="num" w:pos="720"/>
+        </w:tabs>
+        <w:ind w:left="720" w:hanging="360"/>
+      </w:pPr>
+      <w:rPr>
+        <w:rFonts w:ascii="Symbol" w:hAnsi="Symbol" w:hint="default"/>
+        <w:sz w:val="20"/>
+      </w:rPr>
+    </w:lvl>
+    <w:lvl w:ilvl="1" w:tentative="1">
+      <w:start w:val="1"/>
+      <w:numFmt w:val="bullet"/>
+      <w:lvlText w:val="o"/>
+      <w:lvlJc w:val="left"/>
+      <w:pPr>
+        <w:tabs>
+          <w:tab w:val="num" w:pos="1440"/>
+        </w:tabs>
+        <w:ind w:left="1440" w:hanging="360"/>
+      </w:pPr>
+      <w:rPr>
+        <w:rFonts w:ascii="Courier New" w:hAnsi="Courier New" w:hint="default"/>
+        <w:sz w:val="20"/>
+      </w:rPr>
+    </w:lvl>
+    <w:lvl w:ilvl="2" w:tentative="1">
+      <w:start w:val="1"/>
+      <w:numFmt w:val="bullet"/>
+      <w:lvlText w:val=""/>
+      <w:lvlJc w:val="left"/>
+      <w:pPr>
+        <w:tabs>
+          <w:tab w:val="num" w:pos="2160"/>
+        </w:tabs>
+        <w:ind w:left="2160" w:hanging="360"/>
+      </w:pPr>
+      <w:rPr>
+        <w:rFonts w:ascii="Wingdings" w:hAnsi="Wingdings" w:hint="default"/>
+        <w:sz w:val="20"/>
+      </w:rPr>
+    </w:lvl>
+    <w:lvl w:ilvl="3" w:tentative="1">
+      <w:start w:val="1"/>
+      <w:numFmt w:val="bullet"/>
+      <w:lvlText w:val=""/>
+      <w:lvlJc w:val="left"/>
+      <w:pPr>
+        <w:tabs>
+          <w:tab w:val="num" w:pos="2880"/>
+        </w:tabs>
+        <w:ind w:left="2880" w:hanging="360"/>
+      </w:pPr>
+      <w:rPr>
+        <w:rFonts w:ascii="Wingdings" w:hAnsi="Wingdings" w:hint="default"/>
+        <w:sz w:val="20"/>
+      </w:rPr>
+    </w:lvl>
+    <w:lvl w:ilvl="4" w:tentative="1">
+      <w:start w:val="1"/>
+      <w:numFmt w:val="bullet"/>
+      <w:lvlText w:val=""/>
+      <w:lvlJc w:val="left"/>
+      <w:pPr>
+        <w:tabs>
+          <w:tab w:val="num" w:pos="3600"/>
+        </w:tabs>
+        <w:ind w:left="3600" w:hanging="360"/>
+      </w:pPr>
+      <w:rPr>
+        <w:rFonts w:ascii="Wingdings" w:hAnsi="Wingdings" w:hint="default"/>
+        <w:sz w:val="20"/>
+      </w:rPr>
+    </w:lvl>
+    <w:lvl w:ilvl="5" w:tentative="1">
+      <w:start w:val="1"/>
+      <w:numFmt w:val="bullet"/>
+      <w:lvlText w:val=""/>
+      <w:lvlJc w:val="left"/>
+      <w:pPr>
+        <w:tabs>
+          <w:tab w:val="num" w:pos="4320"/>
+        </w:tabs>
+        <w:ind w:left="4320" w:hanging="360"/>
+      </w:pPr>
+      <w:rPr>
+        <w:rFonts w:ascii="Wingdings" w:hAnsi="Wingdings" w:hint="default"/>
+        <w:sz w:val="20"/>
+      </w:rPr>
+    </w:lvl>
+    <w:lvl w:ilvl="6" w:tentative="1">
+      <w:start w:val="1"/>
+      <w:numFmt w:val="bullet"/>
+      <w:lvlText w:val=""/>
+      <w:lvlJc w:val="left"/>
+      <w:pPr>
+        <w:tabs>
+          <w:tab w:val="num" w:pos="5040"/>
+        </w:tabs>
+        <w:ind w:left="5040" w:hanging="360"/>
+      </w:pPr>
+      <w:rPr>
+        <w:rFonts w:ascii="Wingdings" w:hAnsi="Wingdings" w:hint="default"/>
+        <w:sz w:val="20"/>
+      </w:rPr>
+    </w:lvl>
+    <w:lvl w:ilvl="7" w:tentative="1">
+      <w:start w:val="1"/>
+      <w:numFmt w:val="bullet"/>
+      <w:lvlText w:val=""/>
+      <w:lvlJc w:val="left"/>
+      <w:pPr>
+        <w:tabs>
+          <w:tab w:val="num" w:pos="5760"/>
+        </w:tabs>
+        <w:ind w:left="5760" w:hanging="360"/>
+      </w:pPr>
+      <w:rPr>
+        <w:rFonts w:ascii="Wingdings" w:hAnsi="Wingdings" w:hint="default"/>
+        <w:sz w:val="20"/>
+      </w:rPr>
+    </w:lvl>
+    <w:lvl w:ilvl="8" w:tentative="1">
+      <w:start w:val="1"/>
+      <w:numFmt w:val="bullet"/>
+      <w:lvlText w:val=""/>
+      <w:lvlJc w:val="left"/>
+      <w:pPr>
+        <w:tabs>
+          <w:tab w:val="num" w:pos="6480"/>
+        </w:tabs>
+        <w:ind w:left="6480" w:hanging="360"/>
+      </w:pPr>
+      <w:rPr>
+        <w:rFonts w:ascii="Wingdings" w:hAnsi="Wingdings" w:hint="default"/>
+        <w:sz w:val="20"/>
+      </w:rPr>
+    </w:lvl>
+  </w:abstractNum>
+  <w:abstractNum w:abstractNumId="1" w15:restartNumberingAfterBreak="0">
     <w:nsid w:val="1BED162F"/>
     <w:multiLevelType w:val="multilevel"/>
     <w:tmpl w:val="9C1C7DC8"/>
@@ -2462,7 +3125,7 @@
       </w:rPr>
     </w:lvl>
   </w:abstractNum>
-  <w:abstractNum w:abstractNumId="1" w15:restartNumberingAfterBreak="0">
+  <w:abstractNum w:abstractNumId="2" w15:restartNumberingAfterBreak="0">
     <w:nsid w:val="4BCB7E36"/>
     <w:multiLevelType w:val="hybridMultilevel"/>
     <w:tmpl w:val="7254A0FE"/>
@@ -2575,7 +3238,7 @@
       </w:rPr>
     </w:lvl>
   </w:abstractNum>
-  <w:abstractNum w:abstractNumId="2" w15:restartNumberingAfterBreak="0">
+  <w:abstractNum w:abstractNumId="3" w15:restartNumberingAfterBreak="0">
     <w:nsid w:val="5BAE59F4"/>
     <w:multiLevelType w:val="hybridMultilevel"/>
     <w:tmpl w:val="461E79C4"/>
@@ -2796,7 +3459,7 @@
       </w:rPr>
     </w:lvl>
   </w:abstractNum>
-  <w:abstractNum w:abstractNumId="3" w15:restartNumberingAfterBreak="0">
+  <w:abstractNum w:abstractNumId="4" w15:restartNumberingAfterBreak="0">
     <w:nsid w:val="5FDD75EC"/>
     <w:multiLevelType w:val="hybridMultilevel"/>
     <w:tmpl w:val="3CF61FD4"/>
@@ -3008,7 +3671,7 @@
       </w:rPr>
     </w:lvl>
   </w:abstractNum>
-  <w:abstractNum w:abstractNumId="4" w15:restartNumberingAfterBreak="0">
+  <w:abstractNum w:abstractNumId="5" w15:restartNumberingAfterBreak="0">
     <w:nsid w:val="674D4ACB"/>
     <w:multiLevelType w:val="hybridMultilevel"/>
     <w:tmpl w:val="55B8C6E4"/>
@@ -3220,7 +3883,7 @@
       </w:rPr>
     </w:lvl>
   </w:abstractNum>
-  <w:abstractNum w:abstractNumId="5" w15:restartNumberingAfterBreak="0">
+  <w:abstractNum w:abstractNumId="6" w15:restartNumberingAfterBreak="0">
     <w:nsid w:val="690E7EFC"/>
     <w:multiLevelType w:val="hybridMultilevel"/>
     <w:tmpl w:val="D8D2704A"/>
@@ -3334,22 +3997,25 @@
     </w:lvl>
   </w:abstractNum>
   <w:num w:numId="1" w16cid:durableId="1659916139">
+    <w:abstractNumId w:val="5"/>
+  </w:num>
+  <w:num w:numId="2" w16cid:durableId="1499538062">
     <w:abstractNumId w:val="4"/>
   </w:num>
-  <w:num w:numId="2" w16cid:durableId="1499538062">
+  <w:num w:numId="3" w16cid:durableId="290015812">
     <w:abstractNumId w:val="3"/>
   </w:num>
-  <w:num w:numId="3" w16cid:durableId="290015812">
+  <w:num w:numId="4" w16cid:durableId="1024290336">
+    <w:abstractNumId w:val="1"/>
+  </w:num>
+  <w:num w:numId="5" w16cid:durableId="659700512">
+    <w:abstractNumId w:val="6"/>
+  </w:num>
+  <w:num w:numId="6" w16cid:durableId="849639777">
     <w:abstractNumId w:val="2"/>
   </w:num>
-  <w:num w:numId="4" w16cid:durableId="1024290336">
+  <w:num w:numId="7" w16cid:durableId="1781562162">
     <w:abstractNumId w:val="0"/>
-  </w:num>
-  <w:num w:numId="5" w16cid:durableId="659700512">
-    <w:abstractNumId w:val="5"/>
-  </w:num>
-  <w:num w:numId="6" w16cid:durableId="849639777">
-    <w:abstractNumId w:val="1"/>
   </w:num>
 </w:numbering>
 </file>
@@ -3814,7 +4480,6 @@
   <w:style w:type="character" w:default="1" w:styleId="Fontepargpadro">
     <w:name w:val="Default Paragraph Font"/>
     <w:uiPriority w:val="1"/>
-    <w:semiHidden/>
     <w:unhideWhenUsed/>
   </w:style>
   <w:style w:type="table" w:default="1" w:styleId="Tabelanormal">

</xml_diff>